<commit_message>
2nd and 3rd labs
</commit_message>
<xml_diff>
--- a/laba2/моитесты2.docx
+++ b/laba2/моитесты2.docx
@@ -475,11 +475,24 @@
           <w:rFonts w:eastAsia="Times New Roman" w:cs="Times New Roman"/>
           <w:b/>
           <w:bCs/>
+          <w:i/>
+          <w:iCs/>
           <w:kern w:val="0"/>
           <w:szCs w:val="22"/>
           <w14:ligatures w14:val="none"/>
         </w:rPr>
-        <w:t>UNIT-ТЕСТИРОВАНИЯ И ОСНОВЫ ПРОЕКТИРОВАНИЯ ТЕСТОВ</w:t>
+        <w:t>UNIT</w:t>
+      </w:r>
+      <w:r>
+        <w:rPr>
+          <w:rFonts w:eastAsia="Times New Roman" w:cs="Times New Roman"/>
+          <w:b/>
+          <w:bCs/>
+          <w:kern w:val="0"/>
+          <w:szCs w:val="22"/>
+          <w14:ligatures w14:val="none"/>
+        </w:rPr>
+        <w:t>-ТЕСТИРОВАНИЯ И ОСНОВЫ ПРОЕКТИРОВАНИЯ ТЕСТОВ</w:t>
       </w:r>
     </w:p>
     <w:p>
@@ -1116,7 +1129,31 @@
           <w:szCs w:val="28"/>
           <w14:ligatures w14:val="none"/>
         </w:rPr>
-        <w:t>Целью лабораторной работы является изучение принципов модульного тестирования (Unit-тестирования) и получение практических навыков проектирования и реализации автоматизированных тестов для проверки корректности работы программных компонентов.</w:t>
+        <w:t>Целью лабораторной работы является изучение принципов модульного тестирования (</w:t>
+      </w:r>
+      <w:r>
+        <w:rPr>
+          <w:rFonts w:eastAsia="Times New Roman" w:cs="Times New Roman"/>
+          <w:i/>
+          <w:iCs/>
+          <w:color w:val="000000"/>
+          <w:spacing w:val="-4"/>
+          <w:kern w:val="0"/>
+          <w:szCs w:val="28"/>
+          <w14:ligatures w14:val="none"/>
+        </w:rPr>
+        <w:t>Unit</w:t>
+      </w:r>
+      <w:r>
+        <w:rPr>
+          <w:rFonts w:eastAsia="Times New Roman" w:cs="Times New Roman"/>
+          <w:color w:val="000000"/>
+          <w:spacing w:val="-4"/>
+          <w:kern w:val="0"/>
+          <w:szCs w:val="28"/>
+          <w14:ligatures w14:val="none"/>
+        </w:rPr>
+        <w:t>-тестирования) и получение практических навыков проектирования и реализации автоматизированных тестов для проверки корректности работы программных компонентов.</w:t>
       </w:r>
     </w:p>
     <w:p>
@@ -1218,6 +1255,8 @@
       <w:r>
         <w:rPr>
           <w:rFonts w:eastAsia="Times New Roman" w:cs="Times New Roman"/>
+          <w:i/>
+          <w:iCs/>
           <w:color w:val="000000"/>
           <w:spacing w:val="-4"/>
           <w:kern w:val="0"/>
@@ -1384,6 +1423,8 @@
       <w:r>
         <w:rPr>
           <w:rFonts w:eastAsia="Times New Roman" w:cs="Times New Roman"/>
+          <w:i/>
+          <w:iCs/>
           <w:color w:val="000000"/>
           <w:spacing w:val="-4"/>
           <w:kern w:val="0"/>
@@ -1432,6 +1473,8 @@
       <w:r>
         <w:rPr>
           <w:rFonts w:eastAsia="Times New Roman" w:cs="Times New Roman"/>
+          <w:i/>
+          <w:iCs/>
           <w:color w:val="000000"/>
           <w:spacing w:val="-4"/>
           <w:kern w:val="0"/>
@@ -1742,11 +1785,40 @@
         <w:rPr>
           <w:rFonts w:eastAsia="Aptos" w:cs="Times New Roman"/>
         </w:rPr>
-        <w:t>Тестируемый модуль реализован в файле 1laba.js и содержит следующие функции:</w:t>
-      </w:r>
-    </w:p>
-    <w:p>
-      <w:pPr>
+        <w:t>Тестируемый модуль реализован в файле 1</w:t>
+      </w:r>
+      <w:r>
+        <w:rPr>
+          <w:rFonts w:eastAsia="Aptos" w:cs="Times New Roman"/>
+          <w:i/>
+          <w:iCs/>
+        </w:rPr>
+        <w:t>laba</w:t>
+      </w:r>
+      <w:r>
+        <w:rPr>
+          <w:rFonts w:eastAsia="Aptos" w:cs="Times New Roman"/>
+        </w:rPr>
+        <w:t>.</w:t>
+      </w:r>
+      <w:r>
+        <w:rPr>
+          <w:rFonts w:eastAsia="Aptos" w:cs="Times New Roman"/>
+          <w:i/>
+          <w:iCs/>
+        </w:rPr>
+        <w:t>js</w:t>
+      </w:r>
+      <w:r>
+        <w:rPr>
+          <w:rFonts w:eastAsia="Aptos" w:cs="Times New Roman"/>
+        </w:rPr>
+        <w:t xml:space="preserve"> и содержит следующие функции:</w:t>
+      </w:r>
+    </w:p>
+    <w:p>
+      <w:pPr>
+        <w:ind w:firstLine="708"/>
         <w:contextualSpacing/>
         <w:rPr>
           <w:rFonts w:eastAsia="Aptos" w:cs="Times New Roman"/>
@@ -1763,6 +1835,8 @@
       <w:r>
         <w:rPr>
           <w:rFonts w:eastAsia="Aptos" w:cs="Times New Roman"/>
+          <w:i/>
+          <w:iCs/>
         </w:rPr>
         <w:t>calculateSubscriptionEndDate</w:t>
       </w:r>
@@ -1778,6 +1852,8 @@
       <w:r>
         <w:rPr>
           <w:rFonts w:eastAsia="Aptos" w:cs="Times New Roman"/>
+          <w:i/>
+          <w:iCs/>
         </w:rPr>
         <w:t>startDateStr</w:t>
       </w:r>
@@ -1792,6 +1868,8 @@
       <w:r>
         <w:rPr>
           <w:rFonts w:eastAsia="Aptos" w:cs="Times New Roman"/>
+          <w:i/>
+          <w:iCs/>
         </w:rPr>
         <w:t>durationMonths</w:t>
       </w:r>
@@ -1817,6 +1895,7 @@
     </w:p>
     <w:p>
       <w:pPr>
+        <w:ind w:firstLine="708"/>
         <w:contextualSpacing/>
         <w:rPr>
           <w:rFonts w:eastAsia="Aptos" w:cs="Times New Roman"/>
@@ -1833,6 +1912,8 @@
       <w:r>
         <w:rPr>
           <w:rFonts w:eastAsia="Aptos" w:cs="Times New Roman"/>
+          <w:i/>
+          <w:iCs/>
         </w:rPr>
         <w:t>calculateSubscriptionWithPayment</w:t>
       </w:r>
@@ -1848,6 +1929,8 @@
       <w:r>
         <w:rPr>
           <w:rFonts w:eastAsia="Aptos" w:cs="Times New Roman"/>
+          <w:i/>
+          <w:iCs/>
         </w:rPr>
         <w:t>userId</w:t>
       </w:r>
@@ -1862,6 +1945,8 @@
       <w:r>
         <w:rPr>
           <w:rFonts w:eastAsia="Aptos" w:cs="Times New Roman"/>
+          <w:i/>
+          <w:iCs/>
         </w:rPr>
         <w:t>startDateStr</w:t>
       </w:r>
@@ -1876,6 +1961,8 @@
       <w:r>
         <w:rPr>
           <w:rFonts w:eastAsia="Aptos" w:cs="Times New Roman"/>
+          <w:i/>
+          <w:iCs/>
         </w:rPr>
         <w:t>durationMonths</w:t>
       </w:r>
@@ -1915,6 +2002,7 @@
     </w:p>
     <w:p>
       <w:pPr>
+        <w:ind w:firstLine="708"/>
         <w:contextualSpacing/>
         <w:rPr>
           <w:rFonts w:eastAsia="Aptos" w:cs="Times New Roman"/>
@@ -1931,6 +2019,8 @@
       <w:r>
         <w:rPr>
           <w:rFonts w:eastAsia="Aptos" w:cs="Times New Roman"/>
+          <w:i/>
+          <w:iCs/>
         </w:rPr>
         <w:t>isValidDate</w:t>
       </w:r>
@@ -1946,6 +2036,8 @@
       <w:r>
         <w:rPr>
           <w:rFonts w:eastAsia="Aptos" w:cs="Times New Roman"/>
+          <w:i/>
+          <w:iCs/>
         </w:rPr>
         <w:t>day</w:t>
       </w:r>
@@ -1960,6 +2052,8 @@
       <w:r>
         <w:rPr>
           <w:rFonts w:eastAsia="Aptos" w:cs="Times New Roman"/>
+          <w:i/>
+          <w:iCs/>
         </w:rPr>
         <w:t>month</w:t>
       </w:r>
@@ -1974,6 +2068,8 @@
       <w:r>
         <w:rPr>
           <w:rFonts w:eastAsia="Aptos" w:cs="Times New Roman"/>
+          <w:i/>
+          <w:iCs/>
         </w:rPr>
         <w:t>year</w:t>
       </w:r>
@@ -2016,6 +2112,8 @@
       <w:r>
         <w:rPr>
           <w:rFonts w:eastAsia="Aptos" w:cs="Times New Roman"/>
+          <w:i/>
+          <w:iCs/>
         </w:rPr>
         <w:t>PaymentProvider</w:t>
       </w:r>
@@ -2030,6 +2128,8 @@
       <w:r>
         <w:rPr>
           <w:rFonts w:eastAsia="Aptos" w:cs="Times New Roman"/>
+          <w:i/>
+          <w:iCs/>
         </w:rPr>
         <w:t>getLastTransaction</w:t>
       </w:r>
@@ -2044,6 +2144,8 @@
       <w:r>
         <w:rPr>
           <w:rFonts w:eastAsia="Aptos" w:cs="Times New Roman"/>
+          <w:i/>
+          <w:iCs/>
         </w:rPr>
         <w:t>userId</w:t>
       </w:r>
@@ -2067,12 +2169,42 @@
         <w:rPr>
           <w:rFonts w:eastAsia="Aptos" w:cs="Times New Roman"/>
         </w:rPr>
-        <w:t xml:space="preserve">Фрагмент файла 1laba.js с функцией </w:t>
-      </w:r>
-      <w:proofErr w:type="spellStart"/>
-      <w:r>
-        <w:rPr>
-          <w:rFonts w:eastAsia="Aptos" w:cs="Times New Roman"/>
+        <w:t>Фрагмент файла 1</w:t>
+      </w:r>
+      <w:r>
+        <w:rPr>
+          <w:rFonts w:eastAsia="Aptos" w:cs="Times New Roman"/>
+          <w:i/>
+          <w:iCs/>
+        </w:rPr>
+        <w:t>laba</w:t>
+      </w:r>
+      <w:r>
+        <w:rPr>
+          <w:rFonts w:eastAsia="Aptos" w:cs="Times New Roman"/>
+        </w:rPr>
+        <w:t>.</w:t>
+      </w:r>
+      <w:r>
+        <w:rPr>
+          <w:rFonts w:eastAsia="Aptos" w:cs="Times New Roman"/>
+          <w:i/>
+          <w:iCs/>
+        </w:rPr>
+        <w:t>js</w:t>
+      </w:r>
+      <w:r>
+        <w:rPr>
+          <w:rFonts w:eastAsia="Aptos" w:cs="Times New Roman"/>
+        </w:rPr>
+        <w:t xml:space="preserve"> с функцией </w:t>
+      </w:r>
+      <w:proofErr w:type="spellStart"/>
+      <w:r>
+        <w:rPr>
+          <w:rFonts w:eastAsia="Aptos" w:cs="Times New Roman"/>
+          <w:i/>
+          <w:iCs/>
         </w:rPr>
         <w:t>calculateSubscriptionWithPayment</w:t>
       </w:r>
@@ -2205,6 +2337,8 @@
       <w:r>
         <w:rPr>
           <w:rFonts w:eastAsia="Aptos" w:cs="Times New Roman"/>
+          <w:i/>
+          <w:iCs/>
         </w:rPr>
         <w:t>calculateSubscriptionWithPayment</w:t>
       </w:r>
@@ -2243,6 +2377,8 @@
           <w:rFonts w:eastAsia="Aptos" w:cs="Times New Roman"/>
           <w:b/>
           <w:bCs/>
+          <w:i/>
+          <w:iCs/>
         </w:rPr>
         <w:t>Mock</w:t>
       </w:r>
@@ -2296,6 +2432,8 @@
       <w:r>
         <w:rPr>
           <w:rFonts w:eastAsia="Aptos" w:cs="Times New Roman"/>
+          <w:i/>
+          <w:iCs/>
         </w:rPr>
         <w:t>PaymentProvider</w:t>
       </w:r>
@@ -2304,7 +2442,21 @@
         <w:rPr>
           <w:rFonts w:eastAsia="Aptos" w:cs="Times New Roman"/>
         </w:rPr>
-        <w:t xml:space="preserve">. Для соблюдения принципа изоляции Unit-тестирования реальный сервис был </w:t>
+        <w:t xml:space="preserve">. Для соблюдения принципа изоляции </w:t>
+      </w:r>
+      <w:r>
+        <w:rPr>
+          <w:rFonts w:eastAsia="Aptos" w:cs="Times New Roman"/>
+          <w:i/>
+          <w:iCs/>
+        </w:rPr>
+        <w:t>Unit</w:t>
+      </w:r>
+      <w:r>
+        <w:rPr>
+          <w:rFonts w:eastAsia="Aptos" w:cs="Times New Roman"/>
+        </w:rPr>
+        <w:t xml:space="preserve">-тестирования реальный сервис был </w:t>
       </w:r>
       <w:proofErr w:type="spellStart"/>
       <w:r>
@@ -2324,6 +2476,8 @@
       <w:r>
         <w:rPr>
           <w:rFonts w:eastAsia="Aptos" w:cs="Times New Roman"/>
+          <w:i/>
+          <w:iCs/>
         </w:rPr>
         <w:t>mock</w:t>
       </w:r>
@@ -2362,8 +2516,24 @@
       <w:r>
         <w:rPr>
           <w:rFonts w:eastAsia="Aptos" w:cs="Times New Roman"/>
-        </w:rPr>
-        <w:t>jest.mock</w:t>
+          <w:i/>
+          <w:iCs/>
+        </w:rPr>
+        <w:t>jest</w:t>
+      </w:r>
+      <w:r>
+        <w:rPr>
+          <w:rFonts w:eastAsia="Aptos" w:cs="Times New Roman"/>
+        </w:rPr>
+        <w:t>.</w:t>
+      </w:r>
+      <w:r>
+        <w:rPr>
+          <w:rFonts w:eastAsia="Aptos" w:cs="Times New Roman"/>
+          <w:i/>
+          <w:iCs/>
+        </w:rPr>
+        <w:t>mock</w:t>
       </w:r>
       <w:proofErr w:type="spellEnd"/>
       <w:proofErr w:type="gramEnd"/>
@@ -2389,6 +2559,7 @@
           <w:rFonts w:ascii="Courier New" w:eastAsia="Aptos" w:hAnsi="Courier New" w:cs="Courier New"/>
           <w:sz w:val="20"/>
           <w:szCs w:val="18"/>
+          <w:u w:val="single"/>
           <w:lang w:val="en-US"/>
         </w:rPr>
       </w:pPr>
@@ -2399,6 +2570,7 @@
           <w:rFonts w:ascii="Courier New" w:eastAsia="Aptos" w:hAnsi="Courier New" w:cs="Courier New"/>
           <w:sz w:val="20"/>
           <w:szCs w:val="18"/>
+          <w:u w:val="single"/>
           <w:lang w:val="en-US"/>
         </w:rPr>
         <w:t>jest.mock</w:t>
@@ -2410,6 +2582,7 @@
           <w:rFonts w:ascii="Courier New" w:eastAsia="Aptos" w:hAnsi="Courier New" w:cs="Courier New"/>
           <w:sz w:val="20"/>
           <w:szCs w:val="18"/>
+          <w:u w:val="single"/>
           <w:lang w:val="en-US"/>
         </w:rPr>
         <w:t>("./</w:t>
@@ -2420,6 +2593,7 @@
           <w:rFonts w:ascii="Courier New" w:eastAsia="Aptos" w:hAnsi="Courier New" w:cs="Courier New"/>
           <w:sz w:val="20"/>
           <w:szCs w:val="18"/>
+          <w:u w:val="single"/>
           <w:lang w:val="en-US"/>
         </w:rPr>
         <w:t>PaymentProvider</w:t>
@@ -2430,6 +2604,7 @@
           <w:rFonts w:ascii="Courier New" w:eastAsia="Aptos" w:hAnsi="Courier New" w:cs="Courier New"/>
           <w:sz w:val="20"/>
           <w:szCs w:val="18"/>
+          <w:u w:val="single"/>
           <w:lang w:val="en-US"/>
         </w:rPr>
         <w:t>", () =&gt; ({</w:t>
@@ -2442,6 +2617,7 @@
           <w:rFonts w:ascii="Courier New" w:eastAsia="Aptos" w:hAnsi="Courier New" w:cs="Courier New"/>
           <w:sz w:val="20"/>
           <w:szCs w:val="18"/>
+          <w:u w:val="single"/>
           <w:lang w:val="en-US"/>
         </w:rPr>
       </w:pPr>
@@ -2450,6 +2626,7 @@
           <w:rFonts w:ascii="Courier New" w:eastAsia="Aptos" w:hAnsi="Courier New" w:cs="Courier New"/>
           <w:sz w:val="20"/>
           <w:szCs w:val="18"/>
+          <w:u w:val="single"/>
           <w:lang w:val="en-US"/>
         </w:rPr>
         <w:t xml:space="preserve">  </w:t>
@@ -2460,6 +2637,7 @@
           <w:rFonts w:ascii="Courier New" w:eastAsia="Aptos" w:hAnsi="Courier New" w:cs="Courier New"/>
           <w:sz w:val="20"/>
           <w:szCs w:val="18"/>
+          <w:u w:val="single"/>
           <w:lang w:val="en-US"/>
         </w:rPr>
         <w:t>getLastTransaction</w:t>
@@ -2470,6 +2648,7 @@
           <w:rFonts w:ascii="Courier New" w:eastAsia="Aptos" w:hAnsi="Courier New" w:cs="Courier New"/>
           <w:sz w:val="20"/>
           <w:szCs w:val="18"/>
+          <w:u w:val="single"/>
           <w:lang w:val="en-US"/>
         </w:rPr>
         <w:t xml:space="preserve">: </w:t>
@@ -2481,6 +2660,7 @@
           <w:rFonts w:ascii="Courier New" w:eastAsia="Aptos" w:hAnsi="Courier New" w:cs="Courier New"/>
           <w:sz w:val="20"/>
           <w:szCs w:val="18"/>
+          <w:u w:val="single"/>
           <w:lang w:val="en-US"/>
         </w:rPr>
         <w:t>jest.fn</w:t>
@@ -2492,6 +2672,7 @@
           <w:rFonts w:ascii="Courier New" w:eastAsia="Aptos" w:hAnsi="Courier New" w:cs="Courier New"/>
           <w:sz w:val="20"/>
           <w:szCs w:val="18"/>
+          <w:u w:val="single"/>
           <w:lang w:val="en-US"/>
         </w:rPr>
         <w:t>()</w:t>
@@ -2504,6 +2685,7 @@
           <w:rFonts w:ascii="Courier New" w:eastAsia="Aptos" w:hAnsi="Courier New" w:cs="Courier New"/>
           <w:sz w:val="20"/>
           <w:szCs w:val="18"/>
+          <w:u w:val="single"/>
         </w:rPr>
       </w:pPr>
       <w:r>
@@ -2511,6 +2693,7 @@
           <w:rFonts w:ascii="Courier New" w:eastAsia="Aptos" w:hAnsi="Courier New" w:cs="Courier New"/>
           <w:sz w:val="20"/>
           <w:szCs w:val="18"/>
+          <w:u w:val="single"/>
         </w:rPr>
         <w:t>}));</w:t>
       </w:r>
@@ -2591,12 +2774,56 @@
         <w:rPr>
           <w:rFonts w:eastAsia="Aptos" w:cs="Times New Roman"/>
         </w:rPr>
-        <w:t xml:space="preserve">Тесты реализованы в файле 1laba.test.js. Все тесты для асинхронных функций написаны с использованием </w:t>
-      </w:r>
-      <w:proofErr w:type="spellStart"/>
-      <w:r>
-        <w:rPr>
-          <w:rFonts w:eastAsia="Aptos" w:cs="Times New Roman"/>
+        <w:t>Тесты реализованы в файле 1</w:t>
+      </w:r>
+      <w:r>
+        <w:rPr>
+          <w:rFonts w:eastAsia="Aptos" w:cs="Times New Roman"/>
+          <w:i/>
+          <w:iCs/>
+        </w:rPr>
+        <w:t>laba</w:t>
+      </w:r>
+      <w:r>
+        <w:rPr>
+          <w:rFonts w:eastAsia="Aptos" w:cs="Times New Roman"/>
+        </w:rPr>
+        <w:t>.</w:t>
+      </w:r>
+      <w:r>
+        <w:rPr>
+          <w:rFonts w:eastAsia="Aptos" w:cs="Times New Roman"/>
+          <w:i/>
+          <w:iCs/>
+        </w:rPr>
+        <w:t>test</w:t>
+      </w:r>
+      <w:r>
+        <w:rPr>
+          <w:rFonts w:eastAsia="Aptos" w:cs="Times New Roman"/>
+        </w:rPr>
+        <w:t>.</w:t>
+      </w:r>
+      <w:r>
+        <w:rPr>
+          <w:rFonts w:eastAsia="Aptos" w:cs="Times New Roman"/>
+          <w:i/>
+          <w:iCs/>
+        </w:rPr>
+        <w:t>js</w:t>
+      </w:r>
+      <w:r>
+        <w:rPr>
+          <w:rFonts w:eastAsia="Aptos" w:cs="Times New Roman"/>
+        </w:rPr>
+        <w:t xml:space="preserve">. Все тесты для асинхронных функций написаны с использованием </w:t>
+      </w:r>
+      <w:proofErr w:type="spellStart"/>
+      <w:r>
+        <w:rPr>
+          <w:rFonts w:eastAsia="Aptos" w:cs="Times New Roman"/>
+          <w:i/>
+          <w:iCs/>
         </w:rPr>
         <w:t>async</w:t>
       </w:r>
@@ -2611,6 +2838,8 @@
       <w:r>
         <w:rPr>
           <w:rFonts w:eastAsia="Aptos" w:cs="Times New Roman"/>
+          <w:i/>
+          <w:iCs/>
         </w:rPr>
         <w:t>await</w:t>
       </w:r>
@@ -2733,7 +2962,49 @@
         <w:rPr>
           <w:rFonts w:eastAsia="Aptos" w:cs="Times New Roman"/>
         </w:rPr>
-        <w:t>тестирование статусов транзакций DECLINED, PENDING, SUCCESS и неизвестного статуса;</w:t>
+        <w:t xml:space="preserve">тестирование статусов транзакций </w:t>
+      </w:r>
+      <w:r>
+        <w:rPr>
+          <w:rFonts w:eastAsia="Aptos" w:cs="Times New Roman"/>
+          <w:i/>
+          <w:iCs/>
+        </w:rPr>
+        <w:t>DECLINED</w:t>
+      </w:r>
+      <w:r>
+        <w:rPr>
+          <w:rFonts w:eastAsia="Aptos" w:cs="Times New Roman"/>
+        </w:rPr>
+        <w:t xml:space="preserve">, </w:t>
+      </w:r>
+      <w:r>
+        <w:rPr>
+          <w:rFonts w:eastAsia="Aptos" w:cs="Times New Roman"/>
+          <w:i/>
+          <w:iCs/>
+        </w:rPr>
+        <w:t>PENDING</w:t>
+      </w:r>
+      <w:r>
+        <w:rPr>
+          <w:rFonts w:eastAsia="Aptos" w:cs="Times New Roman"/>
+        </w:rPr>
+        <w:t xml:space="preserve">, </w:t>
+      </w:r>
+      <w:r>
+        <w:rPr>
+          <w:rFonts w:eastAsia="Aptos" w:cs="Times New Roman"/>
+          <w:i/>
+          <w:iCs/>
+        </w:rPr>
+        <w:t>SUCCESS</w:t>
+      </w:r>
+      <w:r>
+        <w:rPr>
+          <w:rFonts w:eastAsia="Aptos" w:cs="Times New Roman"/>
+        </w:rPr>
+        <w:t xml:space="preserve"> и неизвестного статуса;</w:t>
       </w:r>
     </w:p>
     <w:p>
@@ -2812,7 +3083,29 @@
         <w:rPr>
           <w:rFonts w:eastAsia="Aptos" w:cs="Times New Roman"/>
         </w:rPr>
-        <w:t>Фрагмент тестов с проверкой статусов DECLINED и PENDING</w:t>
+        <w:t xml:space="preserve">Фрагмент тестов с проверкой статусов </w:t>
+      </w:r>
+      <w:r>
+        <w:rPr>
+          <w:rFonts w:eastAsia="Aptos" w:cs="Times New Roman"/>
+          <w:i/>
+          <w:iCs/>
+        </w:rPr>
+        <w:t>DECLINED</w:t>
+      </w:r>
+      <w:r>
+        <w:rPr>
+          <w:rFonts w:eastAsia="Aptos" w:cs="Times New Roman"/>
+        </w:rPr>
+        <w:t xml:space="preserve"> и </w:t>
+      </w:r>
+      <w:r>
+        <w:rPr>
+          <w:rFonts w:eastAsia="Aptos" w:cs="Times New Roman"/>
+          <w:i/>
+          <w:iCs/>
+        </w:rPr>
+        <w:t>PENDING</w:t>
       </w:r>
       <w:r>
         <w:rPr>
@@ -2984,8 +3277,24 @@
       <w:r>
         <w:rPr>
           <w:rFonts w:eastAsia="Aptos" w:cs="Times New Roman"/>
-        </w:rPr>
-        <w:t>jest.spyOn</w:t>
+          <w:i/>
+          <w:iCs/>
+        </w:rPr>
+        <w:t>jest</w:t>
+      </w:r>
+      <w:r>
+        <w:rPr>
+          <w:rFonts w:eastAsia="Aptos" w:cs="Times New Roman"/>
+        </w:rPr>
+        <w:t>.</w:t>
+      </w:r>
+      <w:r>
+        <w:rPr>
+          <w:rFonts w:eastAsia="Aptos" w:cs="Times New Roman"/>
+          <w:i/>
+          <w:iCs/>
+        </w:rPr>
+        <w:t>spyOn</w:t>
       </w:r>
       <w:proofErr w:type="spellEnd"/>
       <w:proofErr w:type="gramEnd"/>
@@ -3181,7 +3490,35 @@
         <w:rPr>
           <w:rFonts w:eastAsia="Aptos" w:cs="Times New Roman"/>
         </w:rPr>
-        <w:t xml:space="preserve">и убедиться, что при статусах DECLINED и PENDING функция </w:t>
+        <w:t xml:space="preserve">и убедиться, что при статусах </w:t>
+      </w:r>
+      <w:r>
+        <w:rPr>
+          <w:rFonts w:eastAsia="Aptos" w:cs="Times New Roman"/>
+          <w:i/>
+          <w:iCs/>
+        </w:rPr>
+        <w:t>DECLINED</w:t>
+      </w:r>
+      <w:r>
+        <w:rPr>
+          <w:rFonts w:eastAsia="Aptos" w:cs="Times New Roman"/>
+        </w:rPr>
+        <w:t xml:space="preserve"> и </w:t>
+      </w:r>
+      <w:r>
+        <w:rPr>
+          <w:rFonts w:eastAsia="Aptos" w:cs="Times New Roman"/>
+          <w:i/>
+          <w:iCs/>
+        </w:rPr>
+        <w:t>PENDING</w:t>
+      </w:r>
+      <w:r>
+        <w:rPr>
+          <w:rFonts w:eastAsia="Aptos" w:cs="Times New Roman"/>
+        </w:rPr>
+        <w:t xml:space="preserve"> функция </w:t>
       </w:r>
       <w:proofErr w:type="spellStart"/>
       <w:r>
@@ -3223,23 +3560,23 @@
           <w:szCs w:val="28"/>
           <w14:ligatures w14:val="none"/>
         </w:rPr>
-        <w:t xml:space="preserve">Анализ покрытия кода (Code </w:t>
-      </w:r>
-      <w:proofErr w:type="spellStart"/>
+        <w:t>Анализ покрытия кода (</w:t>
+      </w:r>
       <w:r>
         <w:rPr>
           <w:rFonts w:eastAsia="Times New Roman" w:cs="Times New Roman"/>
           <w:b/>
           <w:bCs/>
-          <w:color w:val="000000"/>
-          <w:spacing w:val="-4"/>
-          <w:kern w:val="0"/>
-          <w:szCs w:val="28"/>
-          <w14:ligatures w14:val="none"/>
-        </w:rPr>
-        <w:t>Coverage</w:t>
-      </w:r>
-      <w:proofErr w:type="spellEnd"/>
+          <w:i/>
+          <w:iCs/>
+          <w:color w:val="000000"/>
+          <w:spacing w:val="-4"/>
+          <w:kern w:val="0"/>
+          <w:szCs w:val="28"/>
+          <w14:ligatures w14:val="none"/>
+        </w:rPr>
+        <w:t>Code</w:t>
+      </w:r>
       <w:r>
         <w:rPr>
           <w:rFonts w:eastAsia="Times New Roman" w:cs="Times New Roman"/>
@@ -3251,6 +3588,36 @@
           <w:szCs w:val="28"/>
           <w14:ligatures w14:val="none"/>
         </w:rPr>
+        <w:t xml:space="preserve"> </w:t>
+      </w:r>
+      <w:proofErr w:type="spellStart"/>
+      <w:r>
+        <w:rPr>
+          <w:rFonts w:eastAsia="Times New Roman" w:cs="Times New Roman"/>
+          <w:b/>
+          <w:bCs/>
+          <w:i/>
+          <w:iCs/>
+          <w:color w:val="000000"/>
+          <w:spacing w:val="-4"/>
+          <w:kern w:val="0"/>
+          <w:szCs w:val="28"/>
+          <w14:ligatures w14:val="none"/>
+        </w:rPr>
+        <w:t>Coverage</w:t>
+      </w:r>
+      <w:proofErr w:type="spellEnd"/>
+      <w:r>
+        <w:rPr>
+          <w:rFonts w:eastAsia="Times New Roman" w:cs="Times New Roman"/>
+          <w:b/>
+          <w:bCs/>
+          <w:color w:val="000000"/>
+          <w:spacing w:val="-4"/>
+          <w:kern w:val="0"/>
+          <w:szCs w:val="28"/>
+          <w14:ligatures w14:val="none"/>
+        </w:rPr>
         <w:t>)</w:t>
       </w:r>
     </w:p>
@@ -3281,6 +3648,8 @@
       <w:r>
         <w:rPr>
           <w:rFonts w:eastAsia="Times New Roman" w:cs="Times New Roman"/>
+          <w:i/>
+          <w:iCs/>
           <w:color w:val="000000"/>
           <w:spacing w:val="-4"/>
           <w:kern w:val="0"/>
@@ -3459,6 +3828,8 @@
       <w:r>
         <w:rPr>
           <w:rFonts w:eastAsia="Times New Roman" w:cs="Times New Roman"/>
+          <w:i/>
+          <w:iCs/>
           <w:color w:val="000000"/>
           <w:spacing w:val="-4"/>
           <w:kern w:val="0"/>
@@ -3483,6 +3854,8 @@
       <w:r>
         <w:rPr>
           <w:rFonts w:eastAsia="Times New Roman" w:cs="Times New Roman"/>
+          <w:i/>
+          <w:iCs/>
           <w:color w:val="000000"/>
           <w:spacing w:val="-4"/>
           <w:kern w:val="0"/>
@@ -3507,6 +3880,8 @@
       <w:r>
         <w:rPr>
           <w:rFonts w:eastAsia="Times New Roman" w:cs="Times New Roman"/>
+          <w:i/>
+          <w:iCs/>
           <w:color w:val="000000"/>
           <w:spacing w:val="-4"/>
           <w:kern w:val="0"/>
@@ -3525,7 +3900,31 @@
           <w:szCs w:val="28"/>
           <w14:ligatures w14:val="none"/>
         </w:rPr>
-        <w:t xml:space="preserve"> и % Lines. Анализ </w:t>
+        <w:t xml:space="preserve"> и % </w:t>
+      </w:r>
+      <w:r>
+        <w:rPr>
+          <w:rFonts w:eastAsia="Times New Roman" w:cs="Times New Roman"/>
+          <w:i/>
+          <w:iCs/>
+          <w:color w:val="000000"/>
+          <w:spacing w:val="-4"/>
+          <w:kern w:val="0"/>
+          <w:szCs w:val="28"/>
+          <w14:ligatures w14:val="none"/>
+        </w:rPr>
+        <w:t>Lines</w:t>
+      </w:r>
+      <w:r>
+        <w:rPr>
+          <w:rFonts w:eastAsia="Times New Roman" w:cs="Times New Roman"/>
+          <w:color w:val="000000"/>
+          <w:spacing w:val="-4"/>
+          <w:kern w:val="0"/>
+          <w:szCs w:val="28"/>
+          <w14:ligatures w14:val="none"/>
+        </w:rPr>
+        <w:t xml:space="preserve">. Анализ </w:t>
       </w:r>
       <w:proofErr w:type="spellStart"/>
       <w:r>
@@ -3731,6 +4130,1035 @@
     <w:p>
       <w:pPr>
         <w:jc w:val="center"/>
+        <w:rPr>
+          <w:rFonts w:eastAsia="Times New Roman" w:cs="Times New Roman"/>
+          <w:color w:val="000000"/>
+          <w:spacing w:val="-4"/>
+          <w:kern w:val="0"/>
+          <w:szCs w:val="28"/>
+          <w14:ligatures w14:val="none"/>
+        </w:rPr>
+      </w:pPr>
+    </w:p>
+    <w:p>
+      <w:pPr>
+        <w:rPr>
+          <w:rFonts w:eastAsia="Times New Roman" w:cs="Times New Roman"/>
+          <w:b/>
+          <w:bCs/>
+          <w:color w:val="000000"/>
+          <w:spacing w:val="-4"/>
+          <w:kern w:val="0"/>
+          <w:szCs w:val="28"/>
+          <w14:ligatures w14:val="none"/>
+        </w:rPr>
+      </w:pPr>
+      <w:r>
+        <w:rPr>
+          <w:rFonts w:eastAsia="Times New Roman" w:cs="Times New Roman"/>
+          <w:color w:val="000000"/>
+          <w:spacing w:val="-4"/>
+          <w:kern w:val="0"/>
+          <w:szCs w:val="28"/>
+          <w14:ligatures w14:val="none"/>
+        </w:rPr>
+        <w:tab/>
+      </w:r>
+      <w:r>
+        <w:rPr>
+          <w:rFonts w:eastAsia="Times New Roman" w:cs="Times New Roman"/>
+          <w:b/>
+          <w:bCs/>
+          <w:color w:val="000000"/>
+          <w:spacing w:val="-4"/>
+          <w:kern w:val="0"/>
+          <w:szCs w:val="28"/>
+          <w14:ligatures w14:val="none"/>
+        </w:rPr>
+        <w:t xml:space="preserve">Работа с </w:t>
+      </w:r>
+      <w:proofErr w:type="spellStart"/>
+      <w:r>
+        <w:rPr>
+          <w:rFonts w:eastAsia="Times New Roman" w:cs="Times New Roman"/>
+          <w:b/>
+          <w:bCs/>
+          <w:i/>
+          <w:iCs/>
+          <w:color w:val="000000"/>
+          <w:spacing w:val="-4"/>
+          <w:kern w:val="0"/>
+          <w:szCs w:val="28"/>
+          <w14:ligatures w14:val="none"/>
+        </w:rPr>
+        <w:t>Git</w:t>
+      </w:r>
+      <w:proofErr w:type="spellEnd"/>
+      <w:r>
+        <w:rPr>
+          <w:rFonts w:eastAsia="Times New Roman" w:cs="Times New Roman"/>
+          <w:b/>
+          <w:bCs/>
+          <w:color w:val="000000"/>
+          <w:spacing w:val="-4"/>
+          <w:kern w:val="0"/>
+          <w:szCs w:val="28"/>
+          <w14:ligatures w14:val="none"/>
+        </w:rPr>
+        <w:t xml:space="preserve"> и фиксация результатов</w:t>
+      </w:r>
+    </w:p>
+    <w:p>
+      <w:pPr>
+        <w:ind w:firstLine="708"/>
+        <w:rPr>
+          <w:rFonts w:eastAsia="Times New Roman" w:cs="Times New Roman"/>
+          <w:color w:val="000000"/>
+          <w:spacing w:val="-4"/>
+          <w:kern w:val="0"/>
+          <w:szCs w:val="28"/>
+          <w14:ligatures w14:val="none"/>
+        </w:rPr>
+      </w:pPr>
+      <w:r>
+        <w:rPr>
+          <w:rFonts w:eastAsia="Times New Roman" w:cs="Times New Roman"/>
+          <w:color w:val="000000"/>
+          <w:spacing w:val="-4"/>
+          <w:kern w:val="0"/>
+          <w:szCs w:val="28"/>
+          <w14:ligatures w14:val="none"/>
+        </w:rPr>
+        <w:t>После завершения разработки и тестирования были выполнены следующие действия:</w:t>
+      </w:r>
+    </w:p>
+    <w:p>
+      <w:pPr>
+        <w:ind w:firstLine="708"/>
+        <w:rPr>
+          <w:rFonts w:eastAsia="Times New Roman" w:cs="Times New Roman"/>
+          <w:color w:val="000000"/>
+          <w:spacing w:val="-4"/>
+          <w:kern w:val="0"/>
+          <w:szCs w:val="28"/>
+          <w14:ligatures w14:val="none"/>
+        </w:rPr>
+      </w:pPr>
+      <w:r>
+        <w:rPr>
+          <w:rFonts w:eastAsia="Times New Roman" w:cs="Times New Roman"/>
+          <w:color w:val="000000"/>
+          <w:spacing w:val="-4"/>
+          <w:kern w:val="0"/>
+          <w:szCs w:val="28"/>
+          <w14:ligatures w14:val="none"/>
+        </w:rPr>
+        <w:t xml:space="preserve">– </w:t>
+      </w:r>
+      <w:r>
+        <w:rPr>
+          <w:rFonts w:eastAsia="Times New Roman" w:cs="Times New Roman"/>
+          <w:color w:val="000000"/>
+          <w:spacing w:val="-4"/>
+          <w:kern w:val="0"/>
+          <w:szCs w:val="28"/>
+          <w14:ligatures w14:val="none"/>
+        </w:rPr>
+        <w:t>рефакторинг тестов для повышения читаемости;</w:t>
+      </w:r>
+    </w:p>
+    <w:p>
+      <w:pPr>
+        <w:ind w:firstLine="708"/>
+        <w:rPr>
+          <w:rFonts w:eastAsia="Times New Roman" w:cs="Times New Roman"/>
+          <w:color w:val="000000"/>
+          <w:spacing w:val="-4"/>
+          <w:kern w:val="0"/>
+          <w:szCs w:val="28"/>
+          <w14:ligatures w14:val="none"/>
+        </w:rPr>
+      </w:pPr>
+      <w:r>
+        <w:rPr>
+          <w:rFonts w:eastAsia="Times New Roman" w:cs="Times New Roman"/>
+          <w:color w:val="000000"/>
+          <w:spacing w:val="-4"/>
+          <w:kern w:val="0"/>
+          <w:szCs w:val="28"/>
+          <w14:ligatures w14:val="none"/>
+        </w:rPr>
+        <w:t xml:space="preserve">– </w:t>
+      </w:r>
+      <w:r>
+        <w:rPr>
+          <w:rFonts w:eastAsia="Times New Roman" w:cs="Times New Roman"/>
+          <w:color w:val="000000"/>
+          <w:spacing w:val="-4"/>
+          <w:kern w:val="0"/>
+          <w:szCs w:val="28"/>
+          <w14:ligatures w14:val="none"/>
+        </w:rPr>
+        <w:t xml:space="preserve">фиксация изменений в системе контроля версий </w:t>
+      </w:r>
+      <w:proofErr w:type="spellStart"/>
+      <w:r>
+        <w:rPr>
+          <w:rFonts w:eastAsia="Times New Roman" w:cs="Times New Roman"/>
+          <w:i/>
+          <w:iCs/>
+          <w:color w:val="000000"/>
+          <w:spacing w:val="-4"/>
+          <w:kern w:val="0"/>
+          <w:szCs w:val="28"/>
+          <w14:ligatures w14:val="none"/>
+        </w:rPr>
+        <w:t>Git</w:t>
+      </w:r>
+      <w:proofErr w:type="spellEnd"/>
+      <w:r>
+        <w:rPr>
+          <w:rFonts w:eastAsia="Times New Roman" w:cs="Times New Roman"/>
+          <w:color w:val="000000"/>
+          <w:spacing w:val="-4"/>
+          <w:kern w:val="0"/>
+          <w:szCs w:val="28"/>
+          <w14:ligatures w14:val="none"/>
+        </w:rPr>
+        <w:t>;</w:t>
+      </w:r>
+    </w:p>
+    <w:p>
+      <w:pPr>
+        <w:ind w:firstLine="708"/>
+        <w:rPr>
+          <w:rFonts w:eastAsia="Times New Roman" w:cs="Times New Roman"/>
+          <w:color w:val="000000"/>
+          <w:spacing w:val="-4"/>
+          <w:kern w:val="0"/>
+          <w:szCs w:val="28"/>
+          <w14:ligatures w14:val="none"/>
+        </w:rPr>
+      </w:pPr>
+      <w:r>
+        <w:rPr>
+          <w:rFonts w:eastAsia="Times New Roman" w:cs="Times New Roman"/>
+          <w:color w:val="000000"/>
+          <w:spacing w:val="-4"/>
+          <w:kern w:val="0"/>
+          <w:szCs w:val="28"/>
+          <w14:ligatures w14:val="none"/>
+        </w:rPr>
+        <w:t xml:space="preserve">– </w:t>
+      </w:r>
+      <w:r>
+        <w:rPr>
+          <w:rFonts w:eastAsia="Times New Roman" w:cs="Times New Roman"/>
+          <w:color w:val="000000"/>
+          <w:spacing w:val="-4"/>
+          <w:kern w:val="0"/>
+          <w:szCs w:val="28"/>
+          <w14:ligatures w14:val="none"/>
+        </w:rPr>
+        <w:t xml:space="preserve">отправка кода в </w:t>
+      </w:r>
+      <w:proofErr w:type="spellStart"/>
+      <w:r>
+        <w:rPr>
+          <w:rFonts w:eastAsia="Times New Roman" w:cs="Times New Roman"/>
+          <w:color w:val="000000"/>
+          <w:spacing w:val="-4"/>
+          <w:kern w:val="0"/>
+          <w:szCs w:val="28"/>
+          <w14:ligatures w14:val="none"/>
+        </w:rPr>
+        <w:t>удаленный</w:t>
+      </w:r>
+      <w:proofErr w:type="spellEnd"/>
+      <w:r>
+        <w:rPr>
+          <w:rFonts w:eastAsia="Times New Roman" w:cs="Times New Roman"/>
+          <w:color w:val="000000"/>
+          <w:spacing w:val="-4"/>
+          <w:kern w:val="0"/>
+          <w:szCs w:val="28"/>
+          <w14:ligatures w14:val="none"/>
+        </w:rPr>
+        <w:t xml:space="preserve"> репозиторий.</w:t>
+      </w:r>
+    </w:p>
+    <w:p>
+      <w:pPr>
+        <w:ind w:firstLine="708"/>
+        <w:rPr>
+          <w:rFonts w:eastAsia="Times New Roman" w:cs="Times New Roman"/>
+          <w:color w:val="000000"/>
+          <w:spacing w:val="-4"/>
+          <w:kern w:val="0"/>
+          <w:szCs w:val="28"/>
+          <w:lang w:val="en-US"/>
+          <w14:ligatures w14:val="none"/>
+        </w:rPr>
+      </w:pPr>
+      <w:r>
+        <w:rPr>
+          <w:rFonts w:eastAsia="Times New Roman" w:cs="Times New Roman"/>
+          <w:color w:val="000000"/>
+          <w:spacing w:val="-4"/>
+          <w:kern w:val="0"/>
+          <w:szCs w:val="28"/>
+          <w14:ligatures w14:val="none"/>
+        </w:rPr>
+        <w:t>К</w:t>
+      </w:r>
+      <w:r>
+        <w:rPr>
+          <w:rFonts w:eastAsia="Times New Roman" w:cs="Times New Roman"/>
+          <w:color w:val="000000"/>
+          <w:spacing w:val="-4"/>
+          <w:kern w:val="0"/>
+          <w:szCs w:val="28"/>
+          <w14:ligatures w14:val="none"/>
+        </w:rPr>
+        <w:t>оммит</w:t>
+      </w:r>
+      <w:r>
+        <w:rPr>
+          <w:rFonts w:eastAsia="Times New Roman" w:cs="Times New Roman"/>
+          <w:color w:val="000000"/>
+          <w:spacing w:val="-4"/>
+          <w:kern w:val="0"/>
+          <w:szCs w:val="28"/>
+          <w:lang w:val="en-US"/>
+          <w14:ligatures w14:val="none"/>
+        </w:rPr>
+        <w:t>: «</w:t>
+      </w:r>
+      <w:r>
+        <w:rPr>
+          <w:rFonts w:eastAsia="Times New Roman" w:cs="Times New Roman"/>
+          <w:i/>
+          <w:iCs/>
+          <w:color w:val="000000"/>
+          <w:spacing w:val="-4"/>
+          <w:kern w:val="0"/>
+          <w:szCs w:val="28"/>
+          <w:lang w:val="en-US"/>
+          <w14:ligatures w14:val="none"/>
+        </w:rPr>
+        <w:t>Add</w:t>
+      </w:r>
+      <w:r>
+        <w:rPr>
+          <w:rFonts w:eastAsia="Times New Roman" w:cs="Times New Roman"/>
+          <w:color w:val="000000"/>
+          <w:spacing w:val="-4"/>
+          <w:kern w:val="0"/>
+          <w:szCs w:val="28"/>
+          <w:lang w:val="en-US"/>
+          <w14:ligatures w14:val="none"/>
+        </w:rPr>
+        <w:t xml:space="preserve"> </w:t>
+      </w:r>
+      <w:r>
+        <w:rPr>
+          <w:rFonts w:eastAsia="Times New Roman" w:cs="Times New Roman"/>
+          <w:i/>
+          <w:iCs/>
+          <w:color w:val="000000"/>
+          <w:spacing w:val="-4"/>
+          <w:kern w:val="0"/>
+          <w:szCs w:val="28"/>
+          <w:lang w:val="en-US"/>
+          <w14:ligatures w14:val="none"/>
+        </w:rPr>
+        <w:t>unit</w:t>
+      </w:r>
+      <w:r>
+        <w:rPr>
+          <w:rFonts w:eastAsia="Times New Roman" w:cs="Times New Roman"/>
+          <w:color w:val="000000"/>
+          <w:spacing w:val="-4"/>
+          <w:kern w:val="0"/>
+          <w:szCs w:val="28"/>
+          <w:lang w:val="en-US"/>
+          <w14:ligatures w14:val="none"/>
+        </w:rPr>
+        <w:t xml:space="preserve"> </w:t>
+      </w:r>
+      <w:r>
+        <w:rPr>
+          <w:rFonts w:eastAsia="Times New Roman" w:cs="Times New Roman"/>
+          <w:i/>
+          <w:iCs/>
+          <w:color w:val="000000"/>
+          <w:spacing w:val="-4"/>
+          <w:kern w:val="0"/>
+          <w:szCs w:val="28"/>
+          <w:lang w:val="en-US"/>
+          <w14:ligatures w14:val="none"/>
+        </w:rPr>
+        <w:t>tests</w:t>
+      </w:r>
+      <w:r>
+        <w:rPr>
+          <w:rFonts w:eastAsia="Times New Roman" w:cs="Times New Roman"/>
+          <w:color w:val="000000"/>
+          <w:spacing w:val="-4"/>
+          <w:kern w:val="0"/>
+          <w:szCs w:val="28"/>
+          <w:lang w:val="en-US"/>
+          <w14:ligatures w14:val="none"/>
+        </w:rPr>
+        <w:t xml:space="preserve"> </w:t>
+      </w:r>
+      <w:r>
+        <w:rPr>
+          <w:rFonts w:eastAsia="Times New Roman" w:cs="Times New Roman"/>
+          <w:i/>
+          <w:iCs/>
+          <w:color w:val="000000"/>
+          <w:spacing w:val="-4"/>
+          <w:kern w:val="0"/>
+          <w:szCs w:val="28"/>
+          <w:lang w:val="en-US"/>
+          <w14:ligatures w14:val="none"/>
+        </w:rPr>
+        <w:t>for</w:t>
+      </w:r>
+      <w:r>
+        <w:rPr>
+          <w:rFonts w:eastAsia="Times New Roman" w:cs="Times New Roman"/>
+          <w:color w:val="000000"/>
+          <w:spacing w:val="-4"/>
+          <w:kern w:val="0"/>
+          <w:szCs w:val="28"/>
+          <w:lang w:val="en-US"/>
+          <w14:ligatures w14:val="none"/>
+        </w:rPr>
+        <w:t xml:space="preserve"> </w:t>
+      </w:r>
+      <w:r>
+        <w:rPr>
+          <w:rFonts w:eastAsia="Times New Roman" w:cs="Times New Roman"/>
+          <w:i/>
+          <w:iCs/>
+          <w:color w:val="000000"/>
+          <w:spacing w:val="-4"/>
+          <w:kern w:val="0"/>
+          <w:szCs w:val="28"/>
+          <w:lang w:val="en-US"/>
+          <w14:ligatures w14:val="none"/>
+        </w:rPr>
+        <w:t>subscription</w:t>
+      </w:r>
+      <w:r>
+        <w:rPr>
+          <w:rFonts w:eastAsia="Times New Roman" w:cs="Times New Roman"/>
+          <w:color w:val="000000"/>
+          <w:spacing w:val="-4"/>
+          <w:kern w:val="0"/>
+          <w:szCs w:val="28"/>
+          <w:lang w:val="en-US"/>
+          <w14:ligatures w14:val="none"/>
+        </w:rPr>
+        <w:t xml:space="preserve"> </w:t>
+      </w:r>
+      <w:r>
+        <w:rPr>
+          <w:rFonts w:eastAsia="Times New Roman" w:cs="Times New Roman"/>
+          <w:i/>
+          <w:iCs/>
+          <w:color w:val="000000"/>
+          <w:spacing w:val="-4"/>
+          <w:kern w:val="0"/>
+          <w:szCs w:val="28"/>
+          <w:lang w:val="en-US"/>
+          <w14:ligatures w14:val="none"/>
+        </w:rPr>
+        <w:t>end</w:t>
+      </w:r>
+      <w:r>
+        <w:rPr>
+          <w:rFonts w:eastAsia="Times New Roman" w:cs="Times New Roman"/>
+          <w:color w:val="000000"/>
+          <w:spacing w:val="-4"/>
+          <w:kern w:val="0"/>
+          <w:szCs w:val="28"/>
+          <w:lang w:val="en-US"/>
+          <w14:ligatures w14:val="none"/>
+        </w:rPr>
+        <w:t xml:space="preserve"> </w:t>
+      </w:r>
+      <w:r>
+        <w:rPr>
+          <w:rFonts w:eastAsia="Times New Roman" w:cs="Times New Roman"/>
+          <w:i/>
+          <w:iCs/>
+          <w:color w:val="000000"/>
+          <w:spacing w:val="-4"/>
+          <w:kern w:val="0"/>
+          <w:szCs w:val="28"/>
+          <w:lang w:val="en-US"/>
+          <w14:ligatures w14:val="none"/>
+        </w:rPr>
+        <w:t>date</w:t>
+      </w:r>
+      <w:r>
+        <w:rPr>
+          <w:rFonts w:eastAsia="Times New Roman" w:cs="Times New Roman"/>
+          <w:color w:val="000000"/>
+          <w:spacing w:val="-4"/>
+          <w:kern w:val="0"/>
+          <w:szCs w:val="28"/>
+          <w:lang w:val="en-US"/>
+          <w14:ligatures w14:val="none"/>
+        </w:rPr>
+        <w:t xml:space="preserve"> </w:t>
+      </w:r>
+      <w:r>
+        <w:rPr>
+          <w:rFonts w:eastAsia="Times New Roman" w:cs="Times New Roman"/>
+          <w:i/>
+          <w:iCs/>
+          <w:color w:val="000000"/>
+          <w:spacing w:val="-4"/>
+          <w:kern w:val="0"/>
+          <w:szCs w:val="28"/>
+          <w:lang w:val="en-US"/>
+          <w14:ligatures w14:val="none"/>
+        </w:rPr>
+        <w:t>with</w:t>
+      </w:r>
+      <w:r>
+        <w:rPr>
+          <w:rFonts w:eastAsia="Times New Roman" w:cs="Times New Roman"/>
+          <w:color w:val="000000"/>
+          <w:spacing w:val="-4"/>
+          <w:kern w:val="0"/>
+          <w:szCs w:val="28"/>
+          <w:lang w:val="en-US"/>
+          <w14:ligatures w14:val="none"/>
+        </w:rPr>
+        <w:t xml:space="preserve"> </w:t>
+      </w:r>
+      <w:r>
+        <w:rPr>
+          <w:rFonts w:eastAsia="Times New Roman" w:cs="Times New Roman"/>
+          <w:i/>
+          <w:iCs/>
+          <w:color w:val="000000"/>
+          <w:spacing w:val="-4"/>
+          <w:kern w:val="0"/>
+          <w:szCs w:val="28"/>
+          <w:lang w:val="en-US"/>
+          <w14:ligatures w14:val="none"/>
+        </w:rPr>
+        <w:t>payment</w:t>
+      </w:r>
+      <w:r>
+        <w:rPr>
+          <w:rFonts w:eastAsia="Times New Roman" w:cs="Times New Roman"/>
+          <w:color w:val="000000"/>
+          <w:spacing w:val="-4"/>
+          <w:kern w:val="0"/>
+          <w:szCs w:val="28"/>
+          <w:lang w:val="en-US"/>
+          <w14:ligatures w14:val="none"/>
+        </w:rPr>
+        <w:t xml:space="preserve"> </w:t>
+      </w:r>
+      <w:r>
+        <w:rPr>
+          <w:rFonts w:eastAsia="Times New Roman" w:cs="Times New Roman"/>
+          <w:i/>
+          <w:iCs/>
+          <w:color w:val="000000"/>
+          <w:spacing w:val="-4"/>
+          <w:kern w:val="0"/>
+          <w:szCs w:val="28"/>
+          <w:lang w:val="en-US"/>
+          <w14:ligatures w14:val="none"/>
+        </w:rPr>
+        <w:t>provider</w:t>
+      </w:r>
+      <w:r>
+        <w:rPr>
+          <w:rFonts w:eastAsia="Times New Roman" w:cs="Times New Roman"/>
+          <w:color w:val="000000"/>
+          <w:spacing w:val="-4"/>
+          <w:kern w:val="0"/>
+          <w:szCs w:val="28"/>
+          <w:lang w:val="en-US"/>
+          <w14:ligatures w14:val="none"/>
+        </w:rPr>
+        <w:t xml:space="preserve"> </w:t>
+      </w:r>
+      <w:r>
+        <w:rPr>
+          <w:rFonts w:eastAsia="Times New Roman" w:cs="Times New Roman"/>
+          <w:i/>
+          <w:iCs/>
+          <w:color w:val="000000"/>
+          <w:spacing w:val="-4"/>
+          <w:kern w:val="0"/>
+          <w:szCs w:val="28"/>
+          <w:lang w:val="en-US"/>
+          <w14:ligatures w14:val="none"/>
+        </w:rPr>
+        <w:t>mock</w:t>
+      </w:r>
+      <w:r>
+        <w:rPr>
+          <w:rFonts w:eastAsia="Times New Roman" w:cs="Times New Roman"/>
+          <w:color w:val="000000"/>
+          <w:spacing w:val="-4"/>
+          <w:kern w:val="0"/>
+          <w:szCs w:val="28"/>
+          <w:lang w:val="en-US"/>
+          <w14:ligatures w14:val="none"/>
+        </w:rPr>
+        <w:t>»</w:t>
+      </w:r>
+    </w:p>
+    <w:p>
+      <w:pPr>
+        <w:ind w:firstLine="708"/>
+        <w:rPr>
+          <w:rFonts w:eastAsia="Times New Roman" w:cs="Times New Roman"/>
+          <w:color w:val="000000"/>
+          <w:spacing w:val="-4"/>
+          <w:kern w:val="0"/>
+          <w:szCs w:val="28"/>
+          <w14:ligatures w14:val="none"/>
+        </w:rPr>
+      </w:pPr>
+      <w:r>
+        <w:rPr>
+          <w:rFonts w:eastAsia="Times New Roman" w:cs="Times New Roman"/>
+          <w:color w:val="000000"/>
+          <w:spacing w:val="-4"/>
+          <w:kern w:val="0"/>
+          <w:szCs w:val="28"/>
+          <w14:ligatures w14:val="none"/>
+        </w:rPr>
+        <w:t xml:space="preserve">Скриншот истории коммитов в </w:t>
+      </w:r>
+      <w:proofErr w:type="spellStart"/>
+      <w:r>
+        <w:rPr>
+          <w:rFonts w:eastAsia="Times New Roman" w:cs="Times New Roman"/>
+          <w:i/>
+          <w:iCs/>
+          <w:color w:val="000000"/>
+          <w:spacing w:val="-4"/>
+          <w:kern w:val="0"/>
+          <w:szCs w:val="28"/>
+          <w14:ligatures w14:val="none"/>
+        </w:rPr>
+        <w:t>Git</w:t>
+      </w:r>
+      <w:proofErr w:type="spellEnd"/>
+      <w:r>
+        <w:rPr>
+          <w:rFonts w:eastAsia="Times New Roman" w:cs="Times New Roman"/>
+          <w:color w:val="000000"/>
+          <w:spacing w:val="-4"/>
+          <w:kern w:val="0"/>
+          <w:szCs w:val="28"/>
+          <w14:ligatures w14:val="none"/>
+        </w:rPr>
+        <w:t xml:space="preserve"> </w:t>
+      </w:r>
+      <w:r>
+        <w:rPr>
+          <w:rFonts w:eastAsia="Times New Roman" w:cs="Times New Roman"/>
+          <w:color w:val="000000"/>
+          <w:spacing w:val="-4"/>
+          <w:kern w:val="0"/>
+          <w:szCs w:val="28"/>
+          <w14:ligatures w14:val="none"/>
+        </w:rPr>
+        <w:t>представлен на рисунке 5.</w:t>
+      </w:r>
+    </w:p>
+    <w:p>
+      <w:pPr>
+        <w:ind w:firstLine="708"/>
+        <w:rPr>
+          <w:rFonts w:eastAsia="Times New Roman" w:cs="Times New Roman"/>
+          <w:color w:val="000000"/>
+          <w:spacing w:val="-4"/>
+          <w:kern w:val="0"/>
+          <w:szCs w:val="28"/>
+          <w:lang w:val="en-US"/>
+          <w14:ligatures w14:val="none"/>
+        </w:rPr>
+      </w:pPr>
+    </w:p>
+    <w:p>
+      <w:pPr>
+        <w:jc w:val="center"/>
+        <w:rPr>
+          <w:rFonts w:eastAsia="Times New Roman" w:cs="Times New Roman"/>
+          <w:color w:val="000000"/>
+          <w:spacing w:val="-4"/>
+          <w:kern w:val="0"/>
+          <w:szCs w:val="28"/>
+          <w:lang w:val="en-US"/>
+          <w14:ligatures w14:val="none"/>
+        </w:rPr>
+      </w:pPr>
+      <w:r>
+        <w:rPr>
+          <w:rFonts w:eastAsia="Times New Roman" w:cs="Times New Roman"/>
+          <w:color w:val="000000"/>
+          <w:spacing w:val="-4"/>
+          <w:kern w:val="0"/>
+          <w:szCs w:val="28"/>
+          <w:lang w:val="en-US"/>
+          <w14:ligatures w14:val="none"/>
+        </w:rPr>
+        <w:lastRenderedPageBreak/>
+        <w:drawing>
+          <wp:inline distT="0" distB="0" distL="0" distR="0" wp14:anchorId="65D5C9A6" wp14:editId="55A5DC37">
+            <wp:extent cx="5877745" cy="2181529"/>
+            <wp:effectExtent l="0" t="0" r="8890" b="9525"/>
+            <wp:docPr id="5" name="Рисунок 5"/>
+            <wp:cNvGraphicFramePr>
+              <a:graphicFrameLocks xmlns:a="http://schemas.openxmlformats.org/drawingml/2006/main" noChangeAspect="1"/>
+            </wp:cNvGraphicFramePr>
+            <a:graphic xmlns:a="http://schemas.openxmlformats.org/drawingml/2006/main">
+              <a:graphicData uri="http://schemas.openxmlformats.org/drawingml/2006/picture">
+                <pic:pic xmlns:pic="http://schemas.openxmlformats.org/drawingml/2006/picture">
+                  <pic:nvPicPr>
+                    <pic:cNvPr id="1" name=""/>
+                    <pic:cNvPicPr/>
+                  </pic:nvPicPr>
+                  <pic:blipFill>
+                    <a:blip r:embed="rId9"/>
+                    <a:stretch>
+                      <a:fillRect/>
+                    </a:stretch>
+                  </pic:blipFill>
+                  <pic:spPr>
+                    <a:xfrm>
+                      <a:off x="0" y="0"/>
+                      <a:ext cx="5877745" cy="2181529"/>
+                    </a:xfrm>
+                    <a:prstGeom prst="rect">
+                      <a:avLst/>
+                    </a:prstGeom>
+                  </pic:spPr>
+                </pic:pic>
+              </a:graphicData>
+            </a:graphic>
+          </wp:inline>
+        </w:drawing>
+      </w:r>
+    </w:p>
+    <w:p>
+      <w:pPr>
+        <w:jc w:val="center"/>
+        <w:rPr>
+          <w:rFonts w:eastAsia="Times New Roman" w:cs="Times New Roman"/>
+          <w:color w:val="000000"/>
+          <w:spacing w:val="-4"/>
+          <w:kern w:val="0"/>
+          <w:szCs w:val="28"/>
+          <w:lang w:val="en-US"/>
+          <w14:ligatures w14:val="none"/>
+        </w:rPr>
+      </w:pPr>
+    </w:p>
+    <w:p>
+      <w:pPr>
+        <w:jc w:val="center"/>
+        <w:rPr>
+          <w:rFonts w:eastAsia="Times New Roman" w:cs="Times New Roman"/>
+          <w:color w:val="000000"/>
+          <w:spacing w:val="-4"/>
+          <w:kern w:val="0"/>
+          <w:szCs w:val="28"/>
+          <w14:ligatures w14:val="none"/>
+        </w:rPr>
+      </w:pPr>
+      <w:r>
+        <w:rPr>
+          <w:rFonts w:eastAsia="Times New Roman" w:cs="Times New Roman"/>
+          <w:color w:val="000000"/>
+          <w:spacing w:val="-4"/>
+          <w:kern w:val="0"/>
+          <w:szCs w:val="28"/>
+          <w14:ligatures w14:val="none"/>
+        </w:rPr>
+        <w:t xml:space="preserve">Рисунок 5 – </w:t>
+      </w:r>
+      <w:r>
+        <w:rPr>
+          <w:rFonts w:eastAsia="Times New Roman" w:cs="Times New Roman"/>
+          <w:color w:val="000000"/>
+          <w:spacing w:val="-4"/>
+          <w:kern w:val="0"/>
+          <w:szCs w:val="28"/>
+          <w14:ligatures w14:val="none"/>
+        </w:rPr>
+        <w:t>Истори</w:t>
+      </w:r>
+      <w:r>
+        <w:rPr>
+          <w:rFonts w:eastAsia="Times New Roman" w:cs="Times New Roman"/>
+          <w:color w:val="000000"/>
+          <w:spacing w:val="-4"/>
+          <w:kern w:val="0"/>
+          <w:szCs w:val="28"/>
+          <w14:ligatures w14:val="none"/>
+        </w:rPr>
+        <w:t>я</w:t>
+      </w:r>
+      <w:r>
+        <w:rPr>
+          <w:rFonts w:eastAsia="Times New Roman" w:cs="Times New Roman"/>
+          <w:color w:val="000000"/>
+          <w:spacing w:val="-4"/>
+          <w:kern w:val="0"/>
+          <w:szCs w:val="28"/>
+          <w14:ligatures w14:val="none"/>
+        </w:rPr>
+        <w:t xml:space="preserve"> </w:t>
+      </w:r>
+      <w:r>
+        <w:rPr>
+          <w:rFonts w:eastAsia="Times New Roman" w:cs="Times New Roman"/>
+          <w:color w:val="000000"/>
+          <w:spacing w:val="-4"/>
+          <w:kern w:val="0"/>
+          <w:szCs w:val="28"/>
+          <w14:ligatures w14:val="none"/>
+        </w:rPr>
+        <w:t xml:space="preserve">коммитов в </w:t>
+      </w:r>
+      <w:proofErr w:type="spellStart"/>
+      <w:r>
+        <w:rPr>
+          <w:rFonts w:eastAsia="Times New Roman" w:cs="Times New Roman"/>
+          <w:i/>
+          <w:iCs/>
+          <w:color w:val="000000"/>
+          <w:spacing w:val="-4"/>
+          <w:kern w:val="0"/>
+          <w:szCs w:val="28"/>
+          <w14:ligatures w14:val="none"/>
+        </w:rPr>
+        <w:t>Git</w:t>
+      </w:r>
+      <w:proofErr w:type="spellEnd"/>
+    </w:p>
+    <w:p>
+      <w:pPr>
+        <w:jc w:val="center"/>
+        <w:rPr>
+          <w:rFonts w:eastAsia="Times New Roman" w:cs="Times New Roman"/>
+          <w:color w:val="000000"/>
+          <w:spacing w:val="-4"/>
+          <w:kern w:val="0"/>
+          <w:szCs w:val="28"/>
+          <w14:ligatures w14:val="none"/>
+        </w:rPr>
+      </w:pPr>
+    </w:p>
+    <w:p>
+      <w:pPr>
+        <w:rPr>
+          <w:rFonts w:eastAsia="Times New Roman" w:cs="Times New Roman"/>
+          <w:color w:val="000000"/>
+          <w:spacing w:val="-4"/>
+          <w:kern w:val="0"/>
+          <w:szCs w:val="28"/>
+          <w14:ligatures w14:val="none"/>
+        </w:rPr>
+      </w:pPr>
+      <w:r>
+        <w:rPr>
+          <w:rFonts w:eastAsia="Times New Roman" w:cs="Times New Roman"/>
+          <w:color w:val="000000"/>
+          <w:spacing w:val="-4"/>
+          <w:kern w:val="0"/>
+          <w:szCs w:val="28"/>
+          <w14:ligatures w14:val="none"/>
+        </w:rPr>
+        <w:tab/>
+        <w:t>На этом завершено выполнение лабораторной работы.</w:t>
+      </w:r>
+    </w:p>
+    <w:p>
+      <w:pPr>
+        <w:ind w:firstLine="708"/>
+        <w:rPr>
+          <w:rFonts w:eastAsia="Times New Roman" w:cs="Times New Roman"/>
+          <w:color w:val="000000"/>
+          <w:spacing w:val="-4"/>
+          <w:kern w:val="0"/>
+          <w:szCs w:val="28"/>
+          <w14:ligatures w14:val="none"/>
+        </w:rPr>
+      </w:pPr>
+      <w:r>
+        <w:rPr>
+          <w:rFonts w:eastAsia="Times New Roman" w:cs="Times New Roman"/>
+          <w:color w:val="000000"/>
+          <w:spacing w:val="-4"/>
+          <w:kern w:val="0"/>
+          <w:szCs w:val="28"/>
+          <w14:ligatures w14:val="none"/>
+        </w:rPr>
+        <w:t xml:space="preserve">В ходе выполнения лабораторной работы были изучены и применены основные принципы </w:t>
+      </w:r>
+      <w:r>
+        <w:rPr>
+          <w:rFonts w:eastAsia="Times New Roman" w:cs="Times New Roman"/>
+          <w:i/>
+          <w:iCs/>
+          <w:color w:val="000000"/>
+          <w:spacing w:val="-4"/>
+          <w:kern w:val="0"/>
+          <w:szCs w:val="28"/>
+          <w14:ligatures w14:val="none"/>
+        </w:rPr>
+        <w:t>Unit</w:t>
+      </w:r>
+      <w:r>
+        <w:rPr>
+          <w:rFonts w:eastAsia="Times New Roman" w:cs="Times New Roman"/>
+          <w:color w:val="000000"/>
+          <w:spacing w:val="-4"/>
+          <w:kern w:val="0"/>
+          <w:szCs w:val="28"/>
+          <w14:ligatures w14:val="none"/>
+        </w:rPr>
+        <w:t>-тестирования. Реализовано индивидуальное задание</w:t>
+      </w:r>
+      <w:r>
+        <w:rPr>
+          <w:rFonts w:eastAsia="Times New Roman" w:cs="Times New Roman"/>
+          <w:color w:val="000000"/>
+          <w:spacing w:val="-4"/>
+          <w:kern w:val="0"/>
+          <w:szCs w:val="28"/>
+          <w14:ligatures w14:val="none"/>
+        </w:rPr>
+        <w:t xml:space="preserve"> </w:t>
+      </w:r>
+      <w:r>
+        <w:rPr>
+          <w:rFonts w:eastAsia="Times New Roman" w:cs="Times New Roman"/>
+          <w:color w:val="000000"/>
+          <w:spacing w:val="-4"/>
+          <w:kern w:val="0"/>
+          <w:szCs w:val="28"/>
+          <w14:ligatures w14:val="none"/>
+        </w:rPr>
+        <w:t xml:space="preserve">с использованием </w:t>
+      </w:r>
+      <w:proofErr w:type="spellStart"/>
+      <w:r>
+        <w:rPr>
+          <w:rFonts w:eastAsia="Times New Roman" w:cs="Times New Roman"/>
+          <w:color w:val="000000"/>
+          <w:spacing w:val="-4"/>
+          <w:kern w:val="0"/>
+          <w:szCs w:val="28"/>
+          <w14:ligatures w14:val="none"/>
+        </w:rPr>
+        <w:t>мокирования</w:t>
+      </w:r>
+      <w:proofErr w:type="spellEnd"/>
+      <w:r>
+        <w:rPr>
+          <w:rFonts w:eastAsia="Times New Roman" w:cs="Times New Roman"/>
+          <w:color w:val="000000"/>
+          <w:spacing w:val="-4"/>
+          <w:kern w:val="0"/>
+          <w:szCs w:val="28"/>
+          <w14:ligatures w14:val="none"/>
+        </w:rPr>
+        <w:t xml:space="preserve"> внешнего </w:t>
+      </w:r>
+      <w:proofErr w:type="spellStart"/>
+      <w:r>
+        <w:rPr>
+          <w:rFonts w:eastAsia="Times New Roman" w:cs="Times New Roman"/>
+          <w:color w:val="000000"/>
+          <w:spacing w:val="-4"/>
+          <w:kern w:val="0"/>
+          <w:szCs w:val="28"/>
+          <w14:ligatures w14:val="none"/>
+        </w:rPr>
+        <w:t>платежного</w:t>
+      </w:r>
+      <w:proofErr w:type="spellEnd"/>
+      <w:r>
+        <w:rPr>
+          <w:rFonts w:eastAsia="Times New Roman" w:cs="Times New Roman"/>
+          <w:color w:val="000000"/>
+          <w:spacing w:val="-4"/>
+          <w:kern w:val="0"/>
+          <w:szCs w:val="28"/>
+          <w14:ligatures w14:val="none"/>
+        </w:rPr>
+        <w:t xml:space="preserve"> шлюза. Были разработаны тесты для сложных логических и асинхронных сценариев, включая обработку ошибок и проверку поведения системы.</w:t>
+      </w:r>
+    </w:p>
+    <w:p>
+      <w:pPr>
+        <w:ind w:firstLine="708"/>
+        <w:rPr>
+          <w:rFonts w:eastAsia="Times New Roman" w:cs="Times New Roman"/>
+          <w:color w:val="000000"/>
+          <w:spacing w:val="-4"/>
+          <w:kern w:val="0"/>
+          <w:szCs w:val="28"/>
+          <w14:ligatures w14:val="none"/>
+        </w:rPr>
+      </w:pPr>
+      <w:r>
+        <w:rPr>
+          <w:rFonts w:eastAsia="Times New Roman" w:cs="Times New Roman"/>
+          <w:color w:val="000000"/>
+          <w:spacing w:val="-4"/>
+          <w:kern w:val="0"/>
+          <w:szCs w:val="28"/>
+          <w14:ligatures w14:val="none"/>
+        </w:rPr>
+        <w:t xml:space="preserve">Анализ покрытия кода показал высокий уровень тестового покрытия, что свидетельствует о корректности и </w:t>
+      </w:r>
+      <w:proofErr w:type="spellStart"/>
+      <w:r>
+        <w:rPr>
+          <w:rFonts w:eastAsia="Times New Roman" w:cs="Times New Roman"/>
+          <w:color w:val="000000"/>
+          <w:spacing w:val="-4"/>
+          <w:kern w:val="0"/>
+          <w:szCs w:val="28"/>
+          <w14:ligatures w14:val="none"/>
+        </w:rPr>
+        <w:t>надежности</w:t>
+      </w:r>
+      <w:proofErr w:type="spellEnd"/>
+      <w:r>
+        <w:rPr>
+          <w:rFonts w:eastAsia="Times New Roman" w:cs="Times New Roman"/>
+          <w:color w:val="000000"/>
+          <w:spacing w:val="-4"/>
+          <w:kern w:val="0"/>
+          <w:szCs w:val="28"/>
+          <w14:ligatures w14:val="none"/>
+        </w:rPr>
+        <w:t xml:space="preserve"> реализованного модуля. Поставленные цели и задачи лабораторной работы были полностью достигнуты.</w:t>
+      </w:r>
+    </w:p>
+    <w:p>
+      <w:pPr>
         <w:rPr>
           <w:rFonts w:eastAsia="Times New Roman" w:cs="Times New Roman"/>
           <w:color w:val="000000"/>

</xml_diff>